<commit_message>
Page de garde au format MERCURE et mise à jour du dossier ONEN
- Page de garde reprenant la maquette MERCURE (dossier HKI NE-Sol132) avec
  l'emblème de l'ONG ONEN, la référence et l'objet du DAO 007/2026, générée
  en PDF pour l'offre technique et l'offre financière, placée avant le sommaire
- En-tête MERCURE corrigé (site www.mercure-sarl.org) et logo ONEN en assets
- Coordonnées mises à jour dans toutes les pièces (mercure.niger@gmail.com,
  www.mercure-sarl.org)
- Annexe 3 pré-remplie avec les références réelles (EUCAP Sahel, MCA-Niger,
  HKI, Nations Unies) et alerte sur le besoin d'une référence mobilier scolaire
- Nouvelle pièce n° 12 : liste des marchés similaires exécutés
- Sommaire renuméroté (31 pièces) et plan d'action actualisé

Co-Authored-By: Claude Opus 5 <noreply@anthropic.com>
Claude-Session: https://claude.ai/code/session_017KgrzJui3uU4u3uue6UcyC
</commit_message>
<xml_diff>
--- a/DAO/2026-ONEN-MOBILIERS-SCOLAIRES/docx/00_SOMMAIRE_DU_DOSSIER.docx
+++ b/DAO/2026-ONEN-MOBILIERS-SCOLAIRES/docx/00_SOMMAIRE_DU_DOSSIER.docx
@@ -16,7 +16,10 @@
         <w:rPr>
           <w:b/>
         </w:rPr>
-        <w:t>SOUMISSIONNAIRE : MERCURE SARL – NIAMEY</w:t>
+        <w:t>SOUMISSIONNAIRE : MERCURE SARL — NIAMEY</w:t>
+      </w:r>
+      <w:r>
+        <w:t xml:space="preserve"> 41, Rue de la COPRO — BP : 11 974 Niamey — Tél. : (227) 20 73 40 29 / 20 73 57 23 E-mail : mercure.niger@gmail.com — Site : www.mercure-sarl.org RCCM : NI-NIM-2004-B 717 — NIF : 1392/R</w:t>
       </w:r>
     </w:p>
     <w:p>
@@ -47,6 +50,17 @@
       </w:r>
       <w:r>
         <w:t xml:space="preserve"> ONG ONEN – Coordination Régionale de Dosso</w:t>
+      </w:r>
+    </w:p>
+    <w:p>
+      <w:r>
+        <w:rPr>
+          <w:b/>
+        </w:rPr>
+        <w:t>Partenaire financier :</w:t>
+      </w:r>
+      <w:r>
+        <w:t xml:space="preserve"> Fondation Stromme Niger</w:t>
       </w:r>
     </w:p>
     <w:p>
@@ -185,7 +199,7 @@
               <w:rPr>
                 <w:b/>
               </w:rPr>
-              <w:t>Sommaire</w:t>
+              <w:t>Pièces</w:t>
             </w:r>
           </w:p>
         </w:tc>
@@ -229,7 +243,7 @@
           <w:p>
             <w:r/>
             <w:r>
-              <w:t>Pièces n° 1 à 20</w:t>
+              <w:t>n° 1 à 21</w:t>
             </w:r>
           </w:p>
         </w:tc>
@@ -273,13 +287,21 @@
           <w:p>
             <w:r/>
             <w:r>
-              <w:t>Pièces n° 21 à 24</w:t>
+              <w:t>n° 22 à 25</w:t>
             </w:r>
           </w:p>
         </w:tc>
       </w:tr>
     </w:tbl>
     <w:p/>
+    <w:p>
+      <w:r>
+        <w:rPr>
+          <w:b/>
+        </w:rPr>
+        <w:t>Chaque enveloppe s'ouvre par sa page de garde, placée avant le présent sommaire.</w:t>
+      </w:r>
+    </w:p>
     <w:p>
       <w:pPr>
         <w:pStyle w:val="IntenseQuote"/>
@@ -364,15 +386,14 @@
         <w:tblLook w:firstColumn="1" w:firstRow="1" w:lastColumn="0" w:lastRow="0" w:noHBand="0" w:noVBand="1" w:val="04A0"/>
       </w:tblPr>
       <w:tblGrid>
-        <w:gridCol w:w="2436"/>
-        <w:gridCol w:w="2436"/>
-        <w:gridCol w:w="2436"/>
-        <w:gridCol w:w="2436"/>
+        <w:gridCol w:w="3249"/>
+        <w:gridCol w:w="3249"/>
+        <w:gridCol w:w="3249"/>
       </w:tblGrid>
       <w:tr>
         <w:tc>
           <w:tcPr>
-            <w:tcW w:type="dxa" w:w="2436"/>
+            <w:tcW w:type="dxa" w:w="3249"/>
           </w:tcPr>
           <w:p>
             <w:r>
@@ -390,7 +411,7 @@
         </w:tc>
         <w:tc>
           <w:tcPr>
-            <w:tcW w:type="dxa" w:w="2436"/>
+            <w:tcW w:type="dxa" w:w="3249"/>
           </w:tcPr>
           <w:p>
             <w:r>
@@ -408,25 +429,7 @@
         </w:tc>
         <w:tc>
           <w:tcPr>
-            <w:tcW w:type="dxa" w:w="2436"/>
-          </w:tcPr>
-          <w:p>
-            <w:r>
-              <w:rPr>
-                <w:b/>
-              </w:rPr>
-            </w:r>
-            <w:r>
-              <w:rPr>
-                <w:b/>
-              </w:rPr>
-              <w:t>Origine</w:t>
-            </w:r>
-          </w:p>
-        </w:tc>
-        <w:tc>
-          <w:tcPr>
-            <w:tcW w:type="dxa" w:w="2436"/>
+            <w:tcW w:type="dxa" w:w="3249"/>
           </w:tcPr>
           <w:p>
             <w:r>
@@ -446,7 +449,7 @@
       <w:tr>
         <w:tc>
           <w:tcPr>
-            <w:tcW w:type="dxa" w:w="2436"/>
+            <w:tcW w:type="dxa" w:w="3249"/>
           </w:tcPr>
           <w:p>
             <w:r/>
@@ -460,34 +463,41 @@
         </w:tc>
         <w:tc>
           <w:tcPr>
-            <w:tcW w:type="dxa" w:w="2436"/>
+            <w:tcW w:type="dxa" w:w="3249"/>
           </w:tcPr>
           <w:p>
             <w:r/>
             <w:r>
-              <w:t>Page de garde du dossier (identification MERCURE SARL + objet de l'AO)</w:t>
+              <w:rPr>
+                <w:b/>
+              </w:rPr>
+              <w:t>Page de garde</w:t>
+            </w:r>
+            <w:r>
+              <w:t xml:space="preserve"> — en-tête MERCURE SARL, emblème de l'ONG ONEN, référence et objet du DAO, consistance du lot </w:t>
+            </w:r>
+            <w:r>
+              <w:rPr>
+                <w:i/>
+              </w:rPr>
+              <w:t>(placée en premier, avant le sommaire)</w:t>
             </w:r>
           </w:p>
         </w:tc>
         <w:tc>
           <w:tcPr>
-            <w:tcW w:type="dxa" w:w="2436"/>
+            <w:tcW w:type="dxa" w:w="3249"/>
           </w:tcPr>
           <w:p>
             <w:r/>
             <w:r>
-              <w:t>À produire</w:t>
+              <w:t xml:space="preserve">✅ </w:t>
             </w:r>
-          </w:p>
-        </w:tc>
-        <w:tc>
-          <w:tcPr>
-            <w:tcW w:type="dxa" w:w="2436"/>
-          </w:tcPr>
-          <w:p>
-            <w:r/>
             <w:r>
-              <w:t>✅ Rédigé</w:t>
+              <w:rPr>
+                <w:rFonts w:ascii="Consolas" w:hAnsi="Consolas"/>
+              </w:rPr>
+              <w:t>PAGE_DE_GARDE_technique.pdf</w:t>
             </w:r>
           </w:p>
         </w:tc>
@@ -495,7 +505,7 @@
       <w:tr>
         <w:tc>
           <w:tcPr>
-            <w:tcW w:type="dxa" w:w="2436"/>
+            <w:tcW w:type="dxa" w:w="3249"/>
           </w:tcPr>
           <w:p>
             <w:r/>
@@ -509,29 +519,27 @@
         </w:tc>
         <w:tc>
           <w:tcPr>
-            <w:tcW w:type="dxa" w:w="2436"/>
+            <w:tcW w:type="dxa" w:w="3249"/>
           </w:tcPr>
           <w:p>
             <w:r/>
             <w:r>
-              <w:t>Le présent sommaire numéroté (paginé et signé)</w:t>
+              <w:t xml:space="preserve">Le présent </w:t>
+            </w:r>
+            <w:r>
+              <w:rPr>
+                <w:b/>
+              </w:rPr>
+              <w:t>sommaire numéroté</w:t>
+            </w:r>
+            <w:r>
+              <w:t>, paginé, signé et cacheté</w:t>
             </w:r>
           </w:p>
         </w:tc>
         <w:tc>
           <w:tcPr>
-            <w:tcW w:type="dxa" w:w="2436"/>
-          </w:tcPr>
-          <w:p>
-            <w:r/>
-            <w:r>
-              <w:t>À produire</w:t>
-            </w:r>
-          </w:p>
-        </w:tc>
-        <w:tc>
-          <w:tcPr>
-            <w:tcW w:type="dxa" w:w="2436"/>
+            <w:tcW w:type="dxa" w:w="3249"/>
           </w:tcPr>
           <w:p>
             <w:r/>
@@ -544,7 +552,7 @@
       <w:tr>
         <w:tc>
           <w:tcPr>
-            <w:tcW w:type="dxa" w:w="2436"/>
+            <w:tcW w:type="dxa" w:w="3249"/>
           </w:tcPr>
           <w:p>
             <w:r/>
@@ -558,34 +566,29 @@
         </w:tc>
         <w:tc>
           <w:tcPr>
-            <w:tcW w:type="dxa" w:w="2436"/>
+            <w:tcW w:type="dxa" w:w="3249"/>
           </w:tcPr>
           <w:p>
             <w:r/>
             <w:r>
-              <w:t>Lettre de soumission et de transmission de l'offre, adressée au Coordinateur Régional de l'ONG ONEN Dosso</w:t>
+              <w:rPr>
+                <w:b/>
+              </w:rPr>
+              <w:t>Lettre de soumission et de transmission</w:t>
+            </w:r>
+            <w:r>
+              <w:t xml:space="preserve"> adressée au Coordinateur Régional de l'ONG ONEN Dosso</w:t>
             </w:r>
           </w:p>
         </w:tc>
         <w:tc>
           <w:tcPr>
-            <w:tcW w:type="dxa" w:w="2436"/>
+            <w:tcW w:type="dxa" w:w="3249"/>
           </w:tcPr>
           <w:p>
             <w:r/>
             <w:r>
-              <w:t>À produire</w:t>
-            </w:r>
-          </w:p>
-        </w:tc>
-        <w:tc>
-          <w:tcPr>
-            <w:tcW w:type="dxa" w:w="2436"/>
-          </w:tcPr>
-          <w:p>
-            <w:r/>
-            <w:r>
-              <w:t>✅ Rédigé</w:t>
+              <w:t>✅ Rédigée</w:t>
             </w:r>
           </w:p>
         </w:tc>
@@ -593,7 +596,7 @@
       <w:tr>
         <w:tc>
           <w:tcPr>
-            <w:tcW w:type="dxa" w:w="2436"/>
+            <w:tcW w:type="dxa" w:w="3249"/>
           </w:tcPr>
           <w:p>
             <w:r/>
@@ -607,7 +610,7 @@
         </w:tc>
         <w:tc>
           <w:tcPr>
-            <w:tcW w:type="dxa" w:w="2436"/>
+            <w:tcW w:type="dxa" w:w="3249"/>
           </w:tcPr>
           <w:p>
             <w:r/>
@@ -618,29 +621,18 @@
               <w:t>ANNEXE 1</w:t>
             </w:r>
             <w:r>
-              <w:t xml:space="preserve"> — Formulaire d'information générale sur la société, dûment rempli, signé, daté et cacheté</w:t>
+              <w:t xml:space="preserve"> — Formulaire d'information générale sur la société, rempli, signé, daté et cacheté</w:t>
             </w:r>
           </w:p>
         </w:tc>
         <w:tc>
           <w:tcPr>
-            <w:tcW w:type="dxa" w:w="2436"/>
+            <w:tcW w:type="dxa" w:w="3249"/>
           </w:tcPr>
           <w:p>
             <w:r/>
             <w:r>
-              <w:t>Canevas ONEN</w:t>
-            </w:r>
-          </w:p>
-        </w:tc>
-        <w:tc>
-          <w:tcPr>
-            <w:tcW w:type="dxa" w:w="2436"/>
-          </w:tcPr>
-          <w:p>
-            <w:r/>
-            <w:r>
-              <w:t>✅ Rédigé</w:t>
+              <w:t>✅ Pré-remplie</w:t>
             </w:r>
           </w:p>
         </w:tc>
@@ -837,7 +829,7 @@
               <w:t>Copie légalisée du NIF</w:t>
             </w:r>
             <w:r>
-              <w:t xml:space="preserve"> — N° 1392/R (Certificat d'immatriculation DGI)</w:t>
+              <w:t xml:space="preserve"> — N° 1392/R (certificat d'immatriculation DGI)</w:t>
             </w:r>
           </w:p>
         </w:tc>
@@ -920,7 +912,7 @@
           <w:p>
             <w:r/>
             <w:r>
-              <w:t xml:space="preserve">⚠️ </w:t>
+              <w:t xml:space="preserve">🔴 </w:t>
             </w:r>
             <w:r>
               <w:rPr>
@@ -959,7 +951,7 @@
               <w:t>Attestation de non-faillite</w:t>
             </w:r>
             <w:r>
-              <w:t xml:space="preserve"> (Greffe du Tribunal de Commerce de Niamey), datée de moins de 3 mois</w:t>
+              <w:t xml:space="preserve"> (Greffe du Tribunal de Commerce de Niamey), de moins de 3 mois</w:t>
             </w:r>
           </w:p>
         </w:tc>
@@ -981,7 +973,7 @@
           <w:p>
             <w:r/>
             <w:r>
-              <w:t xml:space="preserve">⚠️ </w:t>
+              <w:t xml:space="preserve">🔴 </w:t>
             </w:r>
             <w:r>
               <w:rPr>
@@ -1042,7 +1034,7 @@
           <w:p>
             <w:r/>
             <w:r>
-              <w:t>✅ Rédigé</w:t>
+              <w:t>✅ Rédigée</w:t>
             </w:r>
           </w:p>
         </w:tc>
@@ -1208,13 +1200,13 @@
           <w:p>
             <w:r/>
             <w:r>
-              <w:t xml:space="preserve">✅ Canevas rédigé → </w:t>
+              <w:t xml:space="preserve">⚠️ </w:t>
             </w:r>
             <w:r>
               <w:rPr>
                 <w:b/>
               </w:rPr>
-              <w:t>à compléter</w:t>
+              <w:t>À COMPLÉTER</w:t>
             </w:r>
           </w:p>
         </w:tc>
@@ -1247,7 +1239,7 @@
               <w:t>Preuves des expériences</w:t>
             </w:r>
             <w:r>
-              <w:t xml:space="preserve"> (une intercalaire par expérience) : extrait de contrat, bon de commande, bon de livraison signé et cacheté par le client, attestation de bonne fin d'exécution</w:t>
+              <w:t xml:space="preserve"> (une intercalaire par expérience, numérotée 11.1 à 11.5) : extrait de contrat, bon de commande, bon de livraison signé et cacheté par le client, attestation de bonne fin d'exécution</w:t>
             </w:r>
           </w:p>
         </w:tc>
@@ -1269,13 +1261,13 @@
           <w:p>
             <w:r/>
             <w:r>
-              <w:t xml:space="preserve">⚠️ </w:t>
+              <w:t xml:space="preserve">🔴 </w:t>
             </w:r>
             <w:r>
               <w:rPr>
                 <w:b/>
               </w:rPr>
-              <w:t>À COLLECTER (5 dossiers)</w:t>
+              <w:t>À COLLECTER</w:t>
             </w:r>
           </w:p>
         </w:tc>
@@ -1305,7 +1297,62 @@
               <w:rPr>
                 <w:b/>
               </w:rPr>
-              <w:t>Lettre d'engagement sur le délai de garantie</w:t>
+              <w:t>Liste complète des marchés similaires exécutés</w:t>
+            </w:r>
+            <w:r>
+              <w:t xml:space="preserve"> (expérience en tant que prestataire — EUCAP Sahel, MCA-Niger, Nations Unies, HKI, OMS, Save the Children…), signée et cachetée</w:t>
+            </w:r>
+          </w:p>
+        </w:tc>
+        <w:tc>
+          <w:tcPr>
+            <w:tcW w:type="dxa" w:w="2436"/>
+          </w:tcPr>
+          <w:p>
+            <w:r/>
+            <w:r>
+              <w:t>—</w:t>
+            </w:r>
+          </w:p>
+        </w:tc>
+        <w:tc>
+          <w:tcPr>
+            <w:tcW w:type="dxa" w:w="2436"/>
+          </w:tcPr>
+          <w:p>
+            <w:r/>
+            <w:r>
+              <w:t>✅ Rédigée</w:t>
+            </w:r>
+          </w:p>
+        </w:tc>
+      </w:tr>
+      <w:tr>
+        <w:tc>
+          <w:tcPr>
+            <w:tcW w:type="dxa" w:w="2436"/>
+          </w:tcPr>
+          <w:p>
+            <w:r/>
+            <w:r>
+              <w:rPr>
+                <w:b/>
+              </w:rPr>
+              <w:t>13</w:t>
+            </w:r>
+          </w:p>
+        </w:tc>
+        <w:tc>
+          <w:tcPr>
+            <w:tcW w:type="dxa" w:w="2436"/>
+          </w:tcPr>
+          <w:p>
+            <w:r/>
+            <w:r>
+              <w:rPr>
+                <w:b/>
+              </w:rPr>
+              <w:t>Engagement sur le délai de garantie</w:t>
             </w:r>
             <w:r>
               <w:t xml:space="preserve"> — vingt-quatre (24) mois offerts (minimum exigé : 1 an)</w:t>
@@ -1346,7 +1393,7 @@
               <w:rPr>
                 <w:b/>
               </w:rPr>
-              <w:t>13</w:t>
+              <w:t>14</w:t>
             </w:r>
           </w:p>
         </w:tc>
@@ -1360,7 +1407,7 @@
               <w:rPr>
                 <w:b/>
               </w:rPr>
-              <w:t>Lettre d'engagement sur le délai de livraison</w:t>
+              <w:t>Engagement sur le délai de livraison</w:t>
             </w:r>
             <w:r>
               <w:t xml:space="preserve"> — vingt (20) jours calendaires (minimum exigé : 20 jours)</w:t>
@@ -1414,13 +1461,7 @@
       </w:pPr>
       <w:r/>
       <w:r>
-        <w:t xml:space="preserve">PARTIE IV — MÉMOIRE TECHNIQUE ET PIÈCES D'APPUI </w:t>
-      </w:r>
-      <w:r>
-        <w:rPr>
-          <w:i/>
-        </w:rPr>
-        <w:t>(non notées mais déterminantes)</w:t>
+        <w:t>PARTIE IV — MÉMOIRE TECHNIQUE ET PIÈCES D'APPUI</w:t>
       </w:r>
     </w:p>
     <w:tbl>
@@ -1501,7 +1542,7 @@
               <w:rPr>
                 <w:b/>
               </w:rPr>
-              <w:t>14</w:t>
+              <w:t>15</w:t>
             </w:r>
           </w:p>
         </w:tc>
@@ -1527,51 +1568,7 @@
               <w:t>à l'identique</w:t>
             </w:r>
             <w:r>
-              <w:t xml:space="preserve"> les spécifications des TDR (tables-bancs, tableaux à chevalet, règles, bureaux, chaises, cadres de hangars), méthodologie de production, plan de charge, plan de livraison Dosso → chefs-lieux → 20 centres, dispositif de réception provisoire</w:t>
-            </w:r>
-          </w:p>
-        </w:tc>
-        <w:tc>
-          <w:tcPr>
-            <w:tcW w:type="dxa" w:w="3249"/>
-          </w:tcPr>
-          <w:p>
-            <w:r/>
-            <w:r>
-              <w:t>✅ Rédigé</w:t>
-            </w:r>
-          </w:p>
-        </w:tc>
-      </w:tr>
-      <w:tr>
-        <w:tc>
-          <w:tcPr>
-            <w:tcW w:type="dxa" w:w="3249"/>
-          </w:tcPr>
-          <w:p>
-            <w:r/>
-            <w:r>
-              <w:rPr>
-                <w:b/>
-              </w:rPr>
-              <w:t>15</w:t>
-            </w:r>
-          </w:p>
-        </w:tc>
-        <w:tc>
-          <w:tcPr>
-            <w:tcW w:type="dxa" w:w="3249"/>
-          </w:tcPr>
-          <w:p>
-            <w:r/>
-            <w:r>
-              <w:rPr>
-                <w:b/>
-              </w:rPr>
-              <w:t>Déclarations particulières (art. XV des TDR)</w:t>
-            </w:r>
-            <w:r>
-              <w:t xml:space="preserve"> : conflit d'intérêts, absence de condamnation (organisation criminelle, corruption, fraude, blanchiment), travail des enfants / travail forcé / discrimination (conventions OIT), conservation des documents pendant 5 ans et accès aux auditeurs</w:t>
+              <w:t xml:space="preserve"> les spécifications des TDR, méthodologie de production, plan de charge, plan de livraison Dosso → chefs-lieux → 20 centres, dispositif de réception provisoire</w:t>
             </w:r>
           </w:p>
         </w:tc>
@@ -1612,10 +1609,54 @@
               <w:rPr>
                 <w:b/>
               </w:rPr>
+              <w:t>Déclarations particulières (art. XV des TDR)</w:t>
+            </w:r>
+            <w:r>
+              <w:t xml:space="preserve"> : conflit d'intérêts, absence de condamnation, travail des enfants / travail forcé / discrimination (conventions OIT), conservation des documents pendant 5 ans et accès aux auditeurs</w:t>
+            </w:r>
+          </w:p>
+        </w:tc>
+        <w:tc>
+          <w:tcPr>
+            <w:tcW w:type="dxa" w:w="3249"/>
+          </w:tcPr>
+          <w:p>
+            <w:r/>
+            <w:r>
+              <w:t>✅ Rédigées</w:t>
+            </w:r>
+          </w:p>
+        </w:tc>
+      </w:tr>
+      <w:tr>
+        <w:tc>
+          <w:tcPr>
+            <w:tcW w:type="dxa" w:w="3249"/>
+          </w:tcPr>
+          <w:p>
+            <w:r/>
+            <w:r>
+              <w:rPr>
+                <w:b/>
+              </w:rPr>
+              <w:t>17</w:t>
+            </w:r>
+          </w:p>
+        </w:tc>
+        <w:tc>
+          <w:tcPr>
+            <w:tcW w:type="dxa" w:w="3249"/>
+          </w:tcPr>
+          <w:p>
+            <w:r/>
+            <w:r>
+              <w:rPr>
+                <w:b/>
+              </w:rPr>
               <w:t>Attestation de chiffre d'affaires</w:t>
             </w:r>
             <w:r>
-              <w:t xml:space="preserve"> certifiée par le Cabinet YERO Audit &amp; Conseil (exercices 2023, 2024, 2025)</w:t>
+              <w:t xml:space="preserve"> certifiée par le Cabinet YERO Audit &amp; Conseil (exercices 2023, 2024 et 2025)</w:t>
             </w:r>
           </w:p>
         </w:tc>
@@ -1642,7 +1683,7 @@
               <w:rPr>
                 <w:b/>
               </w:rPr>
-              <w:t>17</w:t>
+              <w:t>18</w:t>
             </w:r>
           </w:p>
         </w:tc>
@@ -1653,7 +1694,13 @@
           <w:p>
             <w:r/>
             <w:r>
-              <w:t>Présentation de l'entreprise : atelier de menuiserie métallique et bois, liste des équipements, effectif et organigramme de l'équipe affectée au marché</w:t>
+              <w:t xml:space="preserve">Présentation de l'entreprise : atelier de menuiserie métallique et bois, équipements, effectif et organigramme de l'équipe affectée au marché </w:t>
+            </w:r>
+            <w:r>
+              <w:rPr>
+                <w:i/>
+              </w:rPr>
+              <w:t>(intégrée au mémoire technique)</w:t>
             </w:r>
           </w:p>
         </w:tc>
@@ -1664,7 +1711,7 @@
           <w:p>
             <w:r/>
             <w:r>
-              <w:t>✅ Rédigé</w:t>
+              <w:t>✅ Rédigée</w:t>
             </w:r>
           </w:p>
         </w:tc>
@@ -1680,7 +1727,7 @@
               <w:rPr>
                 <w:b/>
               </w:rPr>
-              <w:t>18</w:t>
+              <w:t>19</w:t>
             </w:r>
           </w:p>
         </w:tc>
@@ -1691,7 +1738,7 @@
           <w:p>
             <w:r/>
             <w:r>
-              <w:t>Attestation bancaire / RIB — Compte MERCURE SARL (pour le paiement par virement)</w:t>
+              <w:t>Attestation bancaire / RIB — compte MERCURE SARL (paiement par virement)</w:t>
             </w:r>
           </w:p>
         </w:tc>
@@ -1724,7 +1771,7 @@
               <w:rPr>
                 <w:b/>
               </w:rPr>
-              <w:t>19</w:t>
+              <w:t>20</w:t>
             </w:r>
           </w:p>
         </w:tc>
@@ -1735,7 +1782,7 @@
           <w:p>
             <w:r/>
             <w:r>
-              <w:t>Copie de la pièce d'identité du Directeur Général signataire (+ procuration si le signataire est un mandataire)</w:t>
+              <w:t>Copie de la pièce d'identité du Directeur Général signataire (+ procuration si mandataire)</w:t>
             </w:r>
           </w:p>
         </w:tc>
@@ -1768,7 +1815,7 @@
               <w:rPr>
                 <w:b/>
               </w:rPr>
-              <w:t>20</w:t>
+              <w:t>21</w:t>
             </w:r>
           </w:p>
         </w:tc>
@@ -1779,7 +1826,7 @@
           <w:p>
             <w:r/>
             <w:r>
-              <w:t xml:space="preserve">Photos de réalisations antérieures de mobiliers scolaires (planche photo A4) — </w:t>
+              <w:t xml:space="preserve">Planche photos de réalisations antérieures de mobiliers — </w:t>
             </w:r>
             <w:r>
               <w:rPr>
@@ -1913,50 +1960,6 @@
               <w:rPr>
                 <w:b/>
               </w:rPr>
-              <w:t>21</w:t>
-            </w:r>
-          </w:p>
-        </w:tc>
-        <w:tc>
-          <w:tcPr>
-            <w:tcW w:type="dxa" w:w="3249"/>
-          </w:tcPr>
-          <w:p>
-            <w:r/>
-            <w:r>
-              <w:rPr>
-                <w:b/>
-              </w:rPr>
-              <w:t>Lettre de soumission financière</w:t>
-            </w:r>
-            <w:r>
-              <w:t xml:space="preserve"> : montant total en chiffres et en lettres, en Francs CFA, délai de validité de l'offre (90 jours)</w:t>
-            </w:r>
-          </w:p>
-        </w:tc>
-        <w:tc>
-          <w:tcPr>
-            <w:tcW w:type="dxa" w:w="3249"/>
-          </w:tcPr>
-          <w:p>
-            <w:r/>
-            <w:r>
-              <w:t>✅ Rédigé</w:t>
-            </w:r>
-          </w:p>
-        </w:tc>
-      </w:tr>
-      <w:tr>
-        <w:tc>
-          <w:tcPr>
-            <w:tcW w:type="dxa" w:w="3249"/>
-          </w:tcPr>
-          <w:p>
-            <w:r/>
-            <w:r>
-              <w:rPr>
-                <w:b/>
-              </w:rPr>
               <w:t>22</w:t>
             </w:r>
           </w:p>
@@ -1971,19 +1974,7 @@
               <w:rPr>
                 <w:b/>
               </w:rPr>
-              <w:t>Devis quantitatif et estimatif détaillé</w:t>
-            </w:r>
-            <w:r>
-              <w:t xml:space="preserve"> (bordereau des prix unitaires + quantités + totaux), </w:t>
-            </w:r>
-            <w:r>
-              <w:rPr>
-                <w:b/>
-              </w:rPr>
-              <w:t>vérifié arithmétiquement</w:t>
-            </w:r>
-            <w:r>
-              <w:t>, le total général devant être strictement conforme au montant annoncé dans la lettre</w:t>
+              <w:t>Page de garde de l'offre financière</w:t>
             </w:r>
           </w:p>
         </w:tc>
@@ -1994,13 +1985,13 @@
           <w:p>
             <w:r/>
             <w:r>
-              <w:t xml:space="preserve">✅ Canevas rédigé → </w:t>
+              <w:t xml:space="preserve">✅ </w:t>
             </w:r>
             <w:r>
               <w:rPr>
-                <w:b/>
+                <w:rFonts w:ascii="Consolas" w:hAnsi="Consolas"/>
               </w:rPr>
-              <w:t>prix à arrêter</w:t>
+              <w:t>PAGE_DE_GARDE_financiere.pdf</w:t>
             </w:r>
           </w:p>
         </w:tc>
@@ -2027,7 +2018,13 @@
           <w:p>
             <w:r/>
             <w:r>
-              <w:t>Récapitulatif financier : Total HT — prélèvement ISB de 2 % au profit du Trésor Public — Net à payer, et modalités de paiement (virement bancaire ou chèque au nom de MERCURE SARL)</w:t>
+              <w:rPr>
+                <w:b/>
+              </w:rPr>
+              <w:t>Lettre de soumission financière</w:t>
+            </w:r>
+            <w:r>
+              <w:t xml:space="preserve"> : montant total en chiffres et en lettres, en Francs CFA, validité de l'offre (90 jours)</w:t>
             </w:r>
           </w:p>
         </w:tc>
@@ -2038,7 +2035,7 @@
           <w:p>
             <w:r/>
             <w:r>
-              <w:t>✅ Rédigé</w:t>
+              <w:t>⚠️ Montant à saisir</w:t>
             </w:r>
           </w:p>
         </w:tc>
@@ -2065,13 +2062,22 @@
           <w:p>
             <w:r/>
             <w:r>
-              <w:t xml:space="preserve">Attestation de dispense de l'ISB — </w:t>
+              <w:rPr>
+                <w:b/>
+              </w:rPr>
+              <w:t>Devis quantitatif et estimatif détaillé</w:t>
+            </w:r>
+            <w:r>
+              <w:t xml:space="preserve"> (prix unitaires, quantités, totaux), </w:t>
             </w:r>
             <w:r>
               <w:rPr>
-                <w:i/>
+                <w:b/>
               </w:rPr>
-              <w:t>si MERCURE en dispose ; à défaut, le prélèvement de 2 % s'applique et doit être intégré dans le prix</w:t>
+              <w:t>vérifié arithmétiquement</w:t>
+            </w:r>
+            <w:r>
+              <w:t>, le total général devant être strictement conforme au montant annoncé dans la lettre</w:t>
             </w:r>
           </w:p>
         </w:tc>
@@ -2082,13 +2088,54 @@
           <w:p>
             <w:r/>
             <w:r>
-              <w:t xml:space="preserve">⚠️ </w:t>
+              <w:t>⚠️ Prix à arrêter</w:t>
+            </w:r>
+          </w:p>
+        </w:tc>
+      </w:tr>
+      <w:tr>
+        <w:tc>
+          <w:tcPr>
+            <w:tcW w:type="dxa" w:w="3249"/>
+          </w:tcPr>
+          <w:p>
+            <w:r/>
+            <w:r>
+              <w:rPr>
+                <w:b/>
+              </w:rPr>
+              <w:t>25</w:t>
+            </w:r>
+          </w:p>
+        </w:tc>
+        <w:tc>
+          <w:tcPr>
+            <w:tcW w:type="dxa" w:w="3249"/>
+          </w:tcPr>
+          <w:p>
+            <w:r/>
+            <w:r>
+              <w:t xml:space="preserve">Récapitulatif financier (Total HT — prélèvement ISB de 2 % — net à percevoir), modalités de paiement, et </w:t>
             </w:r>
             <w:r>
               <w:rPr>
                 <w:b/>
               </w:rPr>
-              <w:t>À VÉRIFIER À LA DGI</w:t>
+              <w:t>attestation de dispense ISB</w:t>
+            </w:r>
+            <w:r>
+              <w:t xml:space="preserve"> si MERCURE en dispose</w:t>
+            </w:r>
+          </w:p>
+        </w:tc>
+        <w:tc>
+          <w:tcPr>
+            <w:tcW w:type="dxa" w:w="3249"/>
+          </w:tcPr>
+          <w:p>
+            <w:r/>
+            <w:r>
+              <w:t>⚠️ À vérifier à la DGI</w:t>
             </w:r>
           </w:p>
         </w:tc>
@@ -2174,7 +2221,7 @@
               <w:rPr>
                 <w:b/>
               </w:rPr>
-              <w:t>25</w:t>
+              <w:t>26</w:t>
             </w:r>
           </w:p>
         </w:tc>
@@ -2201,7 +2248,7 @@
               <w:rPr>
                 <w:b/>
               </w:rPr>
-              <w:t>26</w:t>
+              <w:t>27</w:t>
             </w:r>
           </w:p>
         </w:tc>
@@ -2228,7 +2275,7 @@
               <w:rPr>
                 <w:b/>
               </w:rPr>
-              <w:t>27</w:t>
+              <w:t>28</w:t>
             </w:r>
           </w:p>
         </w:tc>
@@ -2239,7 +2286,7 @@
           <w:p>
             <w:r/>
             <w:r>
-              <w:t>Insérer l'offre technique dans l'enveloppe A fermée, l'offre financière dans l'enveloppe B fermée</w:t>
+              <w:t>Insérer l'offre technique dans l'enveloppe A fermée, l'offre financière dans l'enveloppe B fermée, chacune précédée de sa page de garde</w:t>
             </w:r>
           </w:p>
         </w:tc>
@@ -2255,7 +2302,7 @@
               <w:rPr>
                 <w:b/>
               </w:rPr>
-              <w:t>28</w:t>
+              <w:t>29</w:t>
             </w:r>
           </w:p>
         </w:tc>
@@ -2300,7 +2347,7 @@
               <w:rPr>
                 <w:b/>
               </w:rPr>
-              <w:t>29</w:t>
+              <w:t>30</w:t>
             </w:r>
           </w:p>
         </w:tc>
@@ -2336,7 +2383,7 @@
               <w:rPr>
                 <w:b/>
               </w:rPr>
-              <w:t>30</w:t>
+              <w:t>31</w:t>
             </w:r>
           </w:p>
         </w:tc>
@@ -2484,7 +2531,7 @@
           <w:p>
             <w:r/>
             <w:r>
-              <w:t>Expériences similaires prouvées (pièces 10 et 11)</w:t>
+              <w:t>Expériences similaires prouvées (pièces 10 à 12)</w:t>
             </w:r>
           </w:p>
         </w:tc>
@@ -2519,7 +2566,7 @@
           <w:p>
             <w:r/>
             <w:r>
-              <w:t>Délai de garantie (pièce 12)</w:t>
+              <w:t>Délai de garantie (pièce 13)</w:t>
             </w:r>
           </w:p>
         </w:tc>
@@ -2554,7 +2601,7 @@
           <w:p>
             <w:r/>
             <w:r>
-              <w:t>Délai de livraison (pièce 13)</w:t>
+              <w:t>Délai de livraison (pièce 14)</w:t>
             </w:r>
           </w:p>
         </w:tc>

</xml_diff>

<commit_message>
Page de garde : maquette MERCURE d'origine conservée avec ses photos
La version précédente recréait la page et supprimait les bandeaux photos
illustrant les activités de l'entreprise. La page est désormais générée
directement à partir de la maquette d'origine (dossier HKI NE-Sol132) :
design, en-tête et photos inchangés, seuls sont remplacés l'emblème du
client (ONG ONEN), la référence du DAO et son objet.

- assets/page_de_garde.py : script de génération réutilisable
- assets/maquette_mercure_source.jpg : maquette d'origine
- PAGE_DE_GARDE.pdf unique, à imprimer en deux exemplaires
- sommaire, plan d'action et pièce n° 1 mis à jour

Co-Authored-By: Claude Opus 5 <noreply@anthropic.com>
Claude-Session: https://claude.ai/code/session_017KgrzJui3uU4u3uue6UcyC
</commit_message>
<xml_diff>
--- a/DAO/2026-ONEN-MOBILIERS-SCOLAIRES/docx/00_SOMMAIRE_DU_DOSSIER.docx
+++ b/DAO/2026-ONEN-MOBILIERS-SCOLAIRES/docx/00_SOMMAIRE_DU_DOSSIER.docx
@@ -474,7 +474,7 @@
               <w:t>Page de garde</w:t>
             </w:r>
             <w:r>
-              <w:t xml:space="preserve"> — en-tête MERCURE SARL, emblème de l'ONG ONEN, référence et objet du DAO, consistance du lot </w:t>
+              <w:t xml:space="preserve"> — en-tête MERCURE SARL, emblème de l'ONG ONEN, référence et objet du DAO, maquette et photos d’activités conservées </w:t>
             </w:r>
             <w:r>
               <w:rPr>
@@ -497,7 +497,7 @@
               <w:rPr>
                 <w:rFonts w:ascii="Consolas" w:hAnsi="Consolas"/>
               </w:rPr>
-              <w:t>PAGE_DE_GARDE_technique.pdf</w:t>
+              <w:t>PAGE_DE_GARDE.pdf</w:t>
             </w:r>
           </w:p>
         </w:tc>
@@ -1991,7 +1991,10 @@
               <w:rPr>
                 <w:rFonts w:ascii="Consolas" w:hAnsi="Consolas"/>
               </w:rPr>
-              <w:t>PAGE_DE_GARDE_financiere.pdf</w:t>
+              <w:t>PAGE_DE_GARDE.pdf</w:t>
+            </w:r>
+            <w:r>
+              <w:t xml:space="preserve"> (2ᵉ exemplaire)</w:t>
             </w:r>
           </w:p>
         </w:tc>

</xml_diff>